<commit_message>
ETI-60: docs: atualiza Template de Documentações
</commit_message>
<xml_diff>
--- a/Tamplate_Documentacoes.docx
+++ b/Tamplate_Documentacoes.docx
@@ -4,7 +4,21 @@
   <w:body>
     <w:p>
       <w:pPr>
-        <w:spacing w:after="80" w:before="0" w:lineRule="auto"/>
+        <w:keepNext w:val="0"/>
+        <w:keepLines w:val="0"/>
+        <w:pageBreakBefore w:val="0"/>
+        <w:widowControl w:val="1"/>
+        <w:pBdr>
+          <w:top w:space="0" w:sz="0" w:val="nil"/>
+          <w:left w:space="0" w:sz="0" w:val="nil"/>
+          <w:bottom w:space="0" w:sz="0" w:val="nil"/>
+          <w:right w:space="0" w:sz="0" w:val="nil"/>
+          <w:between w:space="0" w:sz="0" w:val="nil"/>
+        </w:pBdr>
+        <w:shd w:fill="auto" w:val="clear"/>
+        <w:spacing w:after="80" w:before="0" w:line="240" w:lineRule="auto"/>
+        <w:ind w:left="0" w:right="0" w:firstLine="0"/>
+        <w:jc w:val="left"/>
         <w:rPr/>
       </w:pPr>
       <w:r>
@@ -502,7 +516,7 @@
     </w:p>
     <w:sdt>
       <w:sdtPr>
-        <w:id w:val="-818077417"/>
+        <w:id w:val="-1916055699"/>
         <w:docPartObj>
           <w:docPartGallery w:val="Table of Contents"/>
           <w:docPartUnique w:val="1"/>
@@ -970,6 +984,7 @@
       <w:tr>
         <w:trPr>
           <w:cantSplit w:val="0"/>
+          <w:trHeight w:val="339.7265625" w:hRule="atLeast"/>
           <w:tblHeader w:val="0"/>
         </w:trPr>
         <w:tc>
@@ -1310,7 +1325,7 @@
                 <w:szCs w:val="18"/>
                 <w:rtl w:val="0"/>
               </w:rPr>
-              <w:t xml:space="preserve">Revisores</w:t>
+              <w:t xml:space="preserve">Autores</w:t>
             </w:r>
             <w:r>
               <w:rPr>
@@ -1346,7 +1361,7 @@
                 <w:szCs w:val="18"/>
                 <w:rtl w:val="0"/>
               </w:rPr>
-              <w:t xml:space="preserve">[Nomes dos Revisores]</w:t>
+              <w:t xml:space="preserve">[Nomes dos Autores]</w:t>
             </w:r>
             <w:r>
               <w:rPr>
@@ -2264,25 +2279,27 @@
           </w:tcPr>
           <w:p>
             <w:pPr>
+              <w:keepNext w:val="0"/>
+              <w:keepLines w:val="0"/>
+              <w:widowControl w:val="1"/>
+              <w:pBdr>
+                <w:top w:space="0" w:sz="0" w:val="nil"/>
+                <w:left w:space="0" w:sz="0" w:val="nil"/>
+                <w:bottom w:space="0" w:sz="0" w:val="nil"/>
+                <w:right w:space="0" w:sz="0" w:val="nil"/>
+                <w:between w:space="0" w:sz="0" w:val="nil"/>
+              </w:pBdr>
+              <w:shd w:fill="auto" w:val="clear"/>
+              <w:spacing w:after="0" w:before="0" w:line="240" w:lineRule="auto"/>
+              <w:ind w:left="0" w:right="0" w:firstLine="0"/>
               <w:jc w:val="left"/>
               <w:rPr/>
             </w:pPr>
             <w:r>
               <w:rPr>
-                <w:rFonts w:ascii="Calibri" w:cs="Calibri" w:eastAsia="Calibri" w:hAnsi="Calibri"/>
-                <w:b w:val="1"/>
-                <w:bCs w:val="1"/>
-                <w:color w:val="4c1d95"/>
-                <w:sz w:val="18"/>
-                <w:szCs w:val="18"/>
                 <w:rtl w:val="0"/>
               </w:rPr>
               <w:t xml:space="preserve">Lojista</w:t>
-            </w:r>
-            <w:r>
-              <w:rPr>
-                <w:rtl w:val="0"/>
-              </w:rPr>
             </w:r>
           </w:p>
         </w:tc>

</xml_diff>